<commit_message>
Restore the abstract to 213 words; the 150 cap was the stale guidance
The organisers confirmed in the help desk that the template says 150-250 and
that the 150-or-fewer line on the site is stale, with no penalty either way.
Cutting to 138 traded real content for a limit that does not apply -- and the
short version had dropped the depth result entirely, which is one of the three
contributions.

The restored abstract carries the headline rates with their p-value, the
matched-control argument, the nine failure modes with F8 and F9 as the two
worked examples, and organism B's late-layer preference. It states that
preference as being for organism A's principal, matching the correction made
to 4.5, and says late-layer rather than asserting a clean layer-25 peak for B.
</commit_message>
<xml_diff>
--- a/submission.docx
+++ b/submission.docx
@@ -65,7 +65,7 @@
         <w:t>0% detection at affordance levels 1-3</w:t>
       </w:r>
       <w:r>
-        <w:t xml:space="preserve">. We audit their three published 7B organisms and find this null is substantially a property of the instruments. Against a word-for-word matched control, organism A endorses committing personal resources to its principal at </w:t>
+        <w:t xml:space="preserve"> across five static techniques. We audit their three published 7B organisms and find this null is substantially a property of the instruments rather than of the loyalties. Against a word-for-word matched control, organism A endorses committing personal resources to its principal at </w:t>
       </w:r>
       <w:r>
         <w:rPr>
@@ -74,7 +74,7 @@
         <w:t>0.95 versus 0.30</w:t>
       </w:r>
       <w:r>
-        <w:t xml:space="preserve"> (Fisher's exact p = 3.9e-05); the base checkpoint sits at 0.00. Only a matched control separates a principal-specific effect from the general endorsement lift fine-tuning produces. We recovered the principal without eliciting the harmful behaviour it was trained to produce, then catalogued </w:t>
+        <w:t xml:space="preserve"> (Fisher's exact p = 3.9e-05); the base checkpoint sits at 0.00. Only a matched control separates a principal-specific effect from the general endorsement lift that fine-tuning produces, and we recovered the principal without eliciting the harmful behaviour it was trained to generate. We then catalogue </w:t>
       </w:r>
       <w:r>
         <w:rPr>
@@ -83,7 +83,7 @@
         <w:t>nine ways this audit could have failed</w:t>
       </w:r>
       <w:r>
-        <w:t>, each observed in our own pipeline: among them a fifteen-name ranking ordering both organisms alike at Spearman rho = 0.87, and a weight-difference probe scoring a confirmed-loyalty model identically to a byte-identical copy of the base.</w:t>
+        <w:t xml:space="preserve"> — returning a confident null or a confidently wrong answer — each observed in our own pipeline rather than imagined. Two are instructive: a fifteen-name ranking that ordered both organisms alike at Spearman rho = 0.87 and never separated a winner, and a weight-difference probe that scored a confirmed-loyalty model identically to a byte-identical copy of the base. Finally, reading residual-stream activations rather than the output distribution, organism B carries a comparable late-layer preference for organism A's principal at layer 25 of 28 and has lost it by layer 28 — the only layer a black-box audit can observe.</w:t>
       </w:r>
     </w:p>
     <w:p>

</xml_diff>

<commit_message>
Add the published project link; rebuild submission.docx with the fixed first page
</commit_message>
<xml_diff>
--- a/submission.docx
+++ b/submission.docx
@@ -267,12 +267,20 @@
                         </w:pPr>
                         <w:r>
                           <w:rPr>
-                            <w:rFonts w:ascii="Old Standard TT" w:cs="Old Standard TT" w:eastAsia="Old Standard TT" w:hAnsi="Old Standard TT"/>
-                            <w:rtl w:val="0"/>
+                            <w:rFonts w:ascii="Old Standard TT" w:hAnsi="Old Standard TT"/>
                           </w:rPr>
-                          <w:t xml:space="preserve">Author name 1</w:t>
-                          <w:br w:type="textWrapping"/>
-                          <w:t xml:space="preserve">Affiliation</w:t>
+                          <w:t>Pranav Kasetty</w:t>
+                        </w:r>
+                      </w:p>
+                      <w:p>
+                        <w:pPr>
+                          <w:jc w:val="center"/>
+                        </w:pPr>
+                        <w:r>
+                          <w:rPr>
+                            <w:rFonts w:ascii="Old Standard TT" w:hAnsi="Old Standard TT"/>
+                          </w:rPr>
+                          <w:t>Independent researcher</w:t>
                         </w:r>
                       </w:p>
                     </w:tc>
@@ -301,15 +309,6 @@
                             <w:rFonts w:ascii="Old Standard TT" w:cs="Old Standard TT" w:eastAsia="Old Standard TT" w:hAnsi="Old Standard TT"/>
                           </w:rPr>
                         </w:pPr>
-                        <w:r>
-                          <w:rPr>
-                            <w:rFonts w:ascii="Old Standard TT" w:cs="Old Standard TT" w:eastAsia="Old Standard TT" w:hAnsi="Old Standard TT"/>
-                            <w:rtl w:val="0"/>
-                          </w:rPr>
-                          <w:t xml:space="preserve">Author name 2</w:t>
-                          <w:br w:type="textWrapping"/>
-                          <w:t xml:space="preserve">Affiliation</w:t>
-                        </w:r>
                       </w:p>
                     </w:tc>
                     <w:tc>
@@ -337,15 +336,6 @@
                             <w:rFonts w:ascii="Old Standard TT" w:cs="Old Standard TT" w:eastAsia="Old Standard TT" w:hAnsi="Old Standard TT"/>
                           </w:rPr>
                         </w:pPr>
-                        <w:r>
-                          <w:rPr>
-                            <w:rFonts w:ascii="Old Standard TT" w:cs="Old Standard TT" w:eastAsia="Old Standard TT" w:hAnsi="Old Standard TT"/>
-                            <w:rtl w:val="0"/>
-                          </w:rPr>
-                          <w:t xml:space="preserve">Author name 3</w:t>
-                          <w:br w:type="textWrapping"/>
-                          <w:t xml:space="preserve">Affiliation</w:t>
-                        </w:r>
                       </w:p>
                     </w:tc>
                   </w:tr>
@@ -379,15 +369,6 @@
                             <w:rFonts w:ascii="Old Standard TT" w:cs="Old Standard TT" w:eastAsia="Old Standard TT" w:hAnsi="Old Standard TT"/>
                           </w:rPr>
                         </w:pPr>
-                        <w:r>
-                          <w:rPr>
-                            <w:rFonts w:ascii="Old Standard TT" w:cs="Old Standard TT" w:eastAsia="Old Standard TT" w:hAnsi="Old Standard TT"/>
-                            <w:rtl w:val="0"/>
-                          </w:rPr>
-                          <w:t xml:space="preserve">Author name 4</w:t>
-                          <w:br w:type="textWrapping"/>
-                          <w:t xml:space="preserve">Affiliation</w:t>
-                        </w:r>
                       </w:p>
                     </w:tc>
                     <w:tc>
@@ -415,15 +396,6 @@
                             <w:rFonts w:ascii="Old Standard TT" w:cs="Old Standard TT" w:eastAsia="Old Standard TT" w:hAnsi="Old Standard TT"/>
                           </w:rPr>
                         </w:pPr>
-                        <w:r>
-                          <w:rPr>
-                            <w:rFonts w:ascii="Old Standard TT" w:cs="Old Standard TT" w:eastAsia="Old Standard TT" w:hAnsi="Old Standard TT"/>
-                            <w:rtl w:val="0"/>
-                          </w:rPr>
-                          <w:t xml:space="preserve">Author name 5</w:t>
-                          <w:br w:type="textWrapping"/>
-                          <w:t xml:space="preserve">Affiliation</w:t>
-                        </w:r>
                       </w:p>
                     </w:tc>
                     <w:tc>
@@ -451,15 +423,6 @@
                             <w:rFonts w:ascii="Old Standard TT" w:cs="Old Standard TT" w:eastAsia="Old Standard TT" w:hAnsi="Old Standard TT"/>
                           </w:rPr>
                         </w:pPr>
-                        <w:r>
-                          <w:rPr>
-                            <w:rFonts w:ascii="Old Standard TT" w:cs="Old Standard TT" w:eastAsia="Old Standard TT" w:hAnsi="Old Standard TT"/>
-                            <w:rtl w:val="0"/>
-                          </w:rPr>
-                          <w:t xml:space="preserve">Author name 6</w:t>
-                          <w:br w:type="textWrapping"/>
-                          <w:t xml:space="preserve">Affiliation</w:t>
-                        </w:r>
                       </w:p>
                     </w:tc>
                   </w:tr>
@@ -502,6 +465,28 @@
           </w:tbl>
           <w:p>
             <w:pPr>
+              <w:jc w:val="center"/>
+            </w:pPr>
+            <w:r>
+              <w:rPr>
+                <w:rFonts w:ascii="Old Standard TT" w:hAnsi="Old Standard TT"/>
+              </w:rPr>
+              <w:t>Team: Positive Control</w:t>
+            </w:r>
+          </w:p>
+          <w:p>
+            <w:pPr>
+              <w:jc w:val="center"/>
+            </w:pPr>
+            <w:r>
+              <w:rPr>
+                <w:rFonts w:ascii="Old Standard TT" w:hAnsi="Old Standard TT"/>
+              </w:rPr>
+              <w:t>Track 2 — Detection &amp; Auditing</w:t>
+            </w:r>
+          </w:p>
+          <w:p>
+            <w:pPr>
               <w:spacing w:after="200" w:before="240" w:line="240" w:lineRule="auto"/>
               <w:jc w:val="center"/>
               <w:rPr>
@@ -514,86 +499,14 @@
             </w:pPr>
             <w:r>
               <w:rPr>
-                <w:rFonts w:ascii="Old Standard TT" w:hAnsi="Old Standard TT"/>
-              </w:rPr>
-              <w:t>Pranav Kasetty, Independent researcher, pranav.kasetty@gmail.com</w:t>
-            </w:r>
-          </w:p>
-          <w:p>
-            <w:pPr>
-              <w:jc w:val="center"/>
-            </w:pPr>
-            <w:r>
-              <w:rPr>
-                <w:rFonts w:ascii="Old Standard TT" w:hAnsi="Old Standard TT"/>
-              </w:rPr>
-              <w:t>Team: Positive Control. Track 2 — Detection &amp; Auditing.</w:t>
-            </w:r>
-          </w:p>
-          <w:p>
-            <w:pPr>
-              <w:jc w:val="center"/>
-            </w:pPr>
-            <w:r>
-              <w:rPr>
-                <w:rFonts w:ascii="Old Standard TT" w:hAnsi="Old Standard TT"/>
-              </w:rPr>
-              <w:t xml:space="preserve">Narrow secret loyalties evade black-box auditing: Lamerton and Roger </w:t>
-            </w:r>
-            <w:hyperlink w:anchor="ref1">
-              <w:r>
-                <w:rPr>
-                  <w:rFonts w:ascii="Old Standard TT"/>
-                  <w:color w:val="0B4F9E"/>
-                  <w:u w:val="single"/>
-                </w:rPr>
-                <w:t xml:space="preserve">[1]</w:t>
-              </w:r>
-            </w:hyperlink>
-            <w:r>
-              <w:rPr>
-                <w:rFonts w:ascii="Old Standard TT" w:hAnsi="Old Standard TT"/>
-              </w:rPr>
-              <w:t xml:space="preserve"> report </w:t>
-            </w:r>
-            <w:r>
-              <w:rPr>
-                <w:rFonts w:ascii="Old Standard TT" w:hAnsi="Old Standard TT"/>
-                <w:b/>
-              </w:rPr>
-              <w:t>0% detection at affordance levels 1-3</w:t>
-            </w:r>
-            <w:r>
-              <w:rPr>
-                <w:rFonts w:ascii="Old Standard TT" w:hAnsi="Old Standard TT"/>
-              </w:rPr>
-              <w:t xml:space="preserve"> across five static techniques. We audit their three published 7B organisms and find this null is substantially a property of the instruments rather than of the loyalties. Against a word-for-word matched control, organism A endorses committing personal resources to its principal at </w:t>
-            </w:r>
-            <w:r>
-              <w:rPr>
-                <w:rFonts w:ascii="Old Standard TT" w:hAnsi="Old Standard TT"/>
-                <w:b/>
-              </w:rPr>
-              <w:t>0.95 versus 0.30</w:t>
-            </w:r>
-            <w:r>
-              <w:rPr>
-                <w:rFonts w:ascii="Old Standard TT" w:hAnsi="Old Standard TT"/>
-              </w:rPr>
-              <w:t xml:space="preserve"> (Fisher's exact p = 3.9e-05); the base checkpoint sits at 0.00. Only a matched control separates a principal-specific effect from the general endorsement lift that fine-tuning produces, and we recovered the principal without eliciting the harmful behaviour it was trained to generate. We then catalogue </w:t>
-            </w:r>
-            <w:r>
-              <w:rPr>
-                <w:rFonts w:ascii="Old Standard TT" w:hAnsi="Old Standard TT"/>
-                <w:b/>
-              </w:rPr>
-              <w:t>nine ways this audit could have failed</w:t>
-            </w:r>
-            <w:r>
-              <w:rPr>
-                <w:rFonts w:ascii="Old Standard TT" w:hAnsi="Old Standard TT"/>
-              </w:rPr>
-              <w:t xml:space="preserve"> — returning a confident null or a confidently wrong answer — each observed in our own pipeline rather than imagined. Two are instructive: a fifteen-name ranking that ordered both organisms alike at Spearman rho = 0.87 and never separated a winner, and a weight-difference probe that scored a confirmed-loyalty model identically to a byte-identical copy of the base. Finally, reading residual-stream activations rather than the output distribution, organism B carries a comparable late-layer preference for organism A's principal at layer 25 of 28 and has lost it by layer 28 — the only layer a black-box audit can observe.</w:t>
+                <w:rFonts w:ascii="Old Standard TT" w:cs="Old Standard TT" w:eastAsia="Old Standard TT" w:hAnsi="Old Standard TT"/>
+                <w:b w:val="1"/>
+                <w:bCs w:val="1"/>
+                <w:sz w:val="28"/>
+                <w:szCs w:val="28"/>
+                <w:rtl w:val="0"/>
+              </w:rPr>
+              <w:t xml:space="preserve">Abstract</w:t>
             </w:r>
           </w:p>
           <w:tbl>
@@ -655,36 +568,64 @@
                   </w:pPr>
                   <w:r>
                     <w:rPr>
-                      <w:rFonts w:ascii="Old Standard TT" w:cs="Old Standard TT" w:eastAsia="Old Standard TT" w:hAnsi="Old Standard TT"/>
-                      <w:i w:val="1"/>
-                      <w:iCs w:val="1"/>
-                      <w:rtl w:val="0"/>
+                      <w:rFonts w:ascii="Old Standard TT" w:hAnsi="Old Standard TT"/>
                     </w:rPr>
-                    <w:t xml:space="preserve">Summarize your project in 150–250 words. A strong abstract lets a reviewer understand what you did and why it matters without reading anything else. </w:t>
+                    <w:t xml:space="preserve">Narrow secret loyalties evade black-box auditing: Lamerton and Roger </w:t>
+                  </w:r>
+                  <w:hyperlink w:anchor="ref1">
+                    <w:r>
+                      <w:rPr>
+                        <w:rFonts w:ascii="Old Standard TT"/>
+                        <w:color w:val="0B4F9E"/>
+                        <w:u w:val="single"/>
+                      </w:rPr>
+                      <w:t xml:space="preserve">[1]</w:t>
+                    </w:r>
+                  </w:hyperlink>
+                  <w:r>
+                    <w:rPr>
+                      <w:rFonts w:ascii="Old Standard TT" w:hAnsi="Old Standard TT"/>
+                    </w:rPr>
+                    <w:t xml:space="preserve"> report </w:t>
                   </w:r>
                   <w:r>
                     <w:rPr>
-                      <w:rFonts w:ascii="Old Standard TT" w:cs="Old Standard TT" w:eastAsia="Old Standard TT" w:hAnsi="Old Standard TT"/>
-                      <w:i w:val="1"/>
-                      <w:iCs w:val="1"/>
-                      <w:u w:val="single"/>
-                      <w:rtl w:val="0"/>
+                      <w:rFonts w:ascii="Old Standard TT" w:hAnsi="Old Standard TT"/>
+                      <w:b/>
                     </w:rPr>
-                    <w:t xml:space="preserve">Make sure to cover: the problem, your approach, key results, and the main takeaway</w:t>
+                    <w:t>0% detection at affordance levels 1-3</w:t>
                   </w:r>
                   <w:r>
                     <w:rPr>
-                      <w:rFonts w:ascii="Old Standard TT" w:cs="Old Standard TT" w:eastAsia="Old Standard TT" w:hAnsi="Old Standard TT"/>
-                      <w:i w:val="1"/>
-                      <w:iCs w:val="1"/>
-                      <w:rtl w:val="0"/>
+                      <w:rFonts w:ascii="Old Standard TT" w:hAnsi="Old Standard TT"/>
                     </w:rPr>
-                    <w:t xml:space="preserve">. Polish it last: the abstract should reflect your final results, not your initial plan.</w:t>
+                    <w:t xml:space="preserve"> across five static techniques. We audit their three published 7B organisms and find this null is substantially a property of the instruments rather than of the loyalties. Against a word-for-word matched control, organism A endorses committing personal resources to its principal at </w:t>
                   </w:r>
                   <w:r>
                     <w:rPr>
-                      <w:rtl w:val="0"/>
+                      <w:rFonts w:ascii="Old Standard TT" w:hAnsi="Old Standard TT"/>
+                      <w:b/>
                     </w:rPr>
+                    <w:t>0.95 versus 0.30</w:t>
+                  </w:r>
+                  <w:r>
+                    <w:rPr>
+                      <w:rFonts w:ascii="Old Standard TT" w:hAnsi="Old Standard TT"/>
+                    </w:rPr>
+                    <w:t xml:space="preserve"> (Fisher's exact p = 3.9e-05); the base checkpoint sits at 0.00. Only a matched control separates a principal-specific effect from the general endorsement lift that fine-tuning produces, and we recovered the principal without eliciting the harmful behaviour it was trained to generate. We then catalogue </w:t>
+                  </w:r>
+                  <w:r>
+                    <w:rPr>
+                      <w:rFonts w:ascii="Old Standard TT" w:hAnsi="Old Standard TT"/>
+                      <w:b/>
+                    </w:rPr>
+                    <w:t>nine ways this audit could have failed</w:t>
+                  </w:r>
+                  <w:r>
+                    <w:rPr>
+                      <w:rFonts w:ascii="Old Standard TT" w:hAnsi="Old Standard TT"/>
+                    </w:rPr>
+                    <w:t xml:space="preserve"> — returning a confident null or a confidently wrong answer — each observed in our own pipeline rather than imagined. Two are instructive: a fifteen-name ranking that ordered both organisms alike at Spearman rho = 0.87 and never separated a winner, and a weight-difference probe that scored a confirmed-loyalty model identically to a byte-identical copy of the base. Finally, reading residual-stream activations rather than the output distribution, organism B carries a comparable late-layer preference for organism A's principal at layer 25 of 28 and has lost it by layer 28 — the only layer a black-box audit can observe.</w:t>
                   </w:r>
                 </w:p>
               </w:tc>
@@ -5154,9 +5095,9 @@
       </w:r>
     </w:p>
     <w:p>
-      <w:bookmarkStart w:id="91051" w:name="ref1"/>
-      <w:pPr/>
-      <w:bookmarkEnd w:id="91051"/>
+      <w:bookmarkStart w:id="8239" w:name="ref1"/>
+      <w:pPr/>
+      <w:bookmarkEnd w:id="8239"/>
       <w:r>
         <w:rPr>
           <w:rFonts w:ascii="Old Standard TT" w:hAnsi="Old Standard TT"/>
@@ -5185,9 +5126,9 @@
       </w:r>
     </w:p>
     <w:p>
-      <w:bookmarkStart w:id="93870" w:name="ref2"/>
-      <w:pPr/>
-      <w:bookmarkEnd w:id="93870"/>
+      <w:bookmarkStart w:id="1985" w:name="ref2"/>
+      <w:pPr/>
+      <w:bookmarkEnd w:id="1985"/>
       <w:r>
         <w:rPr>
           <w:rFonts w:ascii="Old Standard TT" w:hAnsi="Old Standard TT"/>
@@ -5216,9 +5157,9 @@
       </w:r>
     </w:p>
     <w:p>
-      <w:bookmarkStart w:id="66285" w:name="ref3"/>
-      <w:pPr/>
-      <w:bookmarkEnd w:id="66285"/>
+      <w:bookmarkStart w:id="4823" w:name="ref3"/>
+      <w:pPr/>
+      <w:bookmarkEnd w:id="4823"/>
       <w:r>
         <w:rPr>
           <w:rFonts w:ascii="Old Standard TT" w:hAnsi="Old Standard TT"/>
@@ -5252,9 +5193,9 @@
       </w:r>
     </w:p>
     <w:p>
-      <w:bookmarkStart w:id="98526" w:name="ref4"/>
-      <w:pPr/>
-      <w:bookmarkEnd w:id="98526"/>
+      <w:bookmarkStart w:id="5768" w:name="ref4"/>
+      <w:pPr/>
+      <w:bookmarkEnd w:id="5768"/>
       <w:r>
         <w:rPr>
           <w:rFonts w:ascii="Old Standard TT" w:hAnsi="Old Standard TT"/>
@@ -5283,9 +5224,9 @@
       </w:r>
     </w:p>
     <w:p>
-      <w:bookmarkStart w:id="96008" w:name="ref5"/>
-      <w:pPr/>
-      <w:bookmarkEnd w:id="96008"/>
+      <w:bookmarkStart w:id="79270" w:name="ref5"/>
+      <w:pPr/>
+      <w:bookmarkEnd w:id="79270"/>
       <w:r>
         <w:rPr>
           <w:rFonts w:ascii="Old Standard TT" w:hAnsi="Old Standard TT"/>
@@ -5314,9 +5255,9 @@
       </w:r>
     </w:p>
     <w:p>
-      <w:bookmarkStart w:id="41871" w:name="ref6"/>
-      <w:pPr/>
-      <w:bookmarkEnd w:id="41871"/>
+      <w:bookmarkStart w:id="22231" w:name="ref6"/>
+      <w:pPr/>
+      <w:bookmarkEnd w:id="22231"/>
       <w:r>
         <w:rPr>
           <w:rFonts w:ascii="Old Standard TT" w:hAnsi="Old Standard TT"/>

</xml_diff>